<commit_message>
publish student projects (Fall 2026) 2026-09-22 19:30
</commit_message>
<xml_diff>
--- a/GovTech/regularz.docx
+++ b/GovTech/regularz.docx
@@ -2358,13 +2358,13 @@
         <w:rPr>
           <w:b/>
         </w:rPr>
-        <w:t xml:space="preserve">Recommended composition:</w:t>
-      </w:r>
-      <w:r>
-        <w:t xml:space="preserve"> </w:t>
-      </w:r>
-      <w:r>
-        <w:t xml:space="preserve">6 CS + 2 Design + 0 Art (8) — this is a two-role service platform (customer + vendor) with heavy service-flow and dashboard/ops UX and minimal illustrated art (menu photos are vendor-supplied; the rest is UI/branding), so two designers and no dedicated artist (rules: min 1 Design mandated, max 9 total, D+A ≤ 3; see</w:t>
+        <w:t xml:space="preserve">Team composition (set by instructor):</w:t>
+      </w:r>
+      <w:r>
+        <w:t xml:space="preserve"> </w:t>
+      </w:r>
+      <w:r>
+        <w:t xml:space="preserve">6 CS + 1 Design + 0 Art (7) — this is a two-role service platform (customer + vendor) with heavy service-flow and dashboard/ops UX and minimal illustrated art (menu photos are vendor-supplied; the rest is UI/branding), so no dedicated artist (rules: min 1 Design mandated, max 9 total, D+A ≤ 3; see</w:t>
       </w:r>
       <w:r>
         <w:t xml:space="preserve"> </w:t>
@@ -2376,7 +2376,7 @@
         <w:t xml:space="preserve">team-formation.pdf</w:t>
       </w:r>
       <w:r>
-        <w:t xml:space="preserve">). With 0 artists, the designers take the</w:t>
+        <w:t xml:space="preserve">). With 0 artists, the designer takes the</w:t>
       </w:r>
       <w:r>
         <w:t xml:space="preserve"> </w:t>
@@ -2392,6 +2392,51 @@
       </w:r>
       <w:r>
         <w:t xml:space="preserve">as a real graded Design goal each milestone (M1 Art Proof of Concept / M2 Art Implementation Quality) — the last Design goal each milestone.</w:t>
+      </w:r>
+      <w:r>
+        <w:t xml:space="preserve"> </w:t>
+      </w:r>
+      <w:r>
+        <w:rPr>
+          <w:i/>
+        </w:rPr>
+        <w:t xml:space="preserve">Note:</w:t>
+      </w:r>
+      <w:r>
+        <w:t xml:space="preserve"> </w:t>
+      </w:r>
+      <w:r>
+        <w:t xml:space="preserve">this is the</w:t>
+      </w:r>
+      <w:r>
+        <w:t xml:space="preserve"> </w:t>
+      </w:r>
+      <w:r>
+        <w:rPr>
+          <w:b/>
+        </w:rPr>
+        <w:t xml:space="preserve">solo-designer + 0-artist</w:t>
+      </w:r>
+      <w:r>
+        <w:t xml:space="preserve"> </w:t>
+      </w:r>
+      <w:r>
+        <w:t xml:space="preserve">case the design pool flags — one designer now carries the full 4-goals-per-milestone Design + UI/UX load (a genuinely heavy two-role service-design surface)</w:t>
+      </w:r>
+      <w:r>
+        <w:t xml:space="preserve"> </w:t>
+      </w:r>
+      <w:r>
+        <w:rPr>
+          <w:i/>
+        </w:rPr>
+        <w:t xml:space="preserve">and</w:t>
+      </w:r>
+      <w:r>
+        <w:t xml:space="preserve"> </w:t>
+      </w:r>
+      <w:r>
+        <w:t xml:space="preserve">the D11 art surface; a 2nd designer would relieve it if the team can, and the instructor should confirm which conditional bends if the load is too tight.</w:t>
       </w:r>
     </w:p>
     <w:p>
@@ -2459,30 +2504,6 @@
         <w:pStyle w:val="Compact"/>
       </w:pPr>
       <w:r>
-        <w:t xml:space="preserve">M1D6 Service Journey Design (order → paid → preparing → ready → collected, incl. cancel / no-show / out-of-stock paths)</w:t>
-      </w:r>
-    </w:p>
-    <w:p>
-      <w:pPr>
-        <w:numPr>
-          <w:ilvl w:val="1"/>
-          <w:numId w:val="1019"/>
-        </w:numPr>
-        <w:pStyle w:val="Compact"/>
-      </w:pPr>
-      <w:r>
-        <w:t xml:space="preserve">M1D3 User Research, Personas &amp; Competitive Analysis (small F&amp;B owners + regulars; Grab/Foodpanda/EPOS/Ritual teardown)</w:t>
-      </w:r>
-    </w:p>
-    <w:p>
-      <w:pPr>
-        <w:numPr>
-          <w:ilvl w:val="1"/>
-          <w:numId w:val="1019"/>
-        </w:numPr>
-        <w:pStyle w:val="Compact"/>
-      </w:pPr>
-      <w:r>
         <w:t xml:space="preserve">M1D11 Art POC (conditional — no artist) — the design-owned art surface (style guide, iconography, UI, menu-card system)</w:t>
       </w:r>
     </w:p>
@@ -2522,30 +2543,6 @@
         <w:pStyle w:val="Compact"/>
       </w:pPr>
       <w:r>
-        <w:t xml:space="preserve">M2D6 Service polished end to end (order → ETA → QR → collected, both roles)</w:t>
-      </w:r>
-    </w:p>
-    <w:p>
-      <w:pPr>
-        <w:numPr>
-          <w:ilvl w:val="1"/>
-          <w:numId w:val="1020"/>
-        </w:numPr>
-        <w:pStyle w:val="Compact"/>
-      </w:pPr>
-      <w:r>
-        <w:t xml:space="preserve">M2D8 Status &amp; Notification pass (order-ready, ETA changes, collection confirm — reassurance at every state)</w:t>
-      </w:r>
-    </w:p>
-    <w:p>
-      <w:pPr>
-        <w:numPr>
-          <w:ilvl w:val="1"/>
-          <w:numId w:val="1020"/>
-        </w:numPr>
-        <w:pStyle w:val="Compact"/>
-      </w:pPr>
-      <w:r>
         <w:t xml:space="preserve">M2D11 Art Implementation Quality (conditional — no artist) — implemented art aligned with the POC, no placeholders</w:t>
       </w:r>
     </w:p>
@@ -2585,30 +2582,6 @@
     <w:p>
       <w:pPr>
         <w:numPr>
-          <w:ilvl w:val="1"/>
-          <w:numId w:val="1021"/>
-        </w:numPr>
-        <w:pStyle w:val="Compact"/>
-      </w:pPr>
-      <w:r>
-        <w:t xml:space="preserve">M1U2 UX Flows &amp; Wireframes — browse → order → track → collect; vendor order-management.</w:t>
-      </w:r>
-    </w:p>
-    <w:p>
-      <w:pPr>
-        <w:numPr>
-          <w:ilvl w:val="1"/>
-          <w:numId w:val="1021"/>
-        </w:numPr>
-        <w:pStyle w:val="Compact"/>
-      </w:pPr>
-      <w:r>
-        <w:t xml:space="preserve">M1U3 Accessibility &amp; Readability Foundations — legible menu/queue typography, contrast, thumb-reach targets.</w:t>
-      </w:r>
-    </w:p>
-    <w:p>
-      <w:pPr>
-        <w:numPr>
           <w:ilvl w:val="0"/>
           <w:numId w:val="1018"/>
         </w:numPr>
@@ -2648,30 +2621,6 @@
     <w:p>
       <w:pPr>
         <w:numPr>
-          <w:ilvl w:val="1"/>
-          <w:numId w:val="1022"/>
-        </w:numPr>
-        <w:pStyle w:val="Compact"/>
-      </w:pPr>
-      <w:r>
-        <w:t xml:space="preserve">M2U3 Menu &amp; HUD Motion Design — order-state transitions, ETA updates, QR reveal.</w:t>
-      </w:r>
-    </w:p>
-    <w:p>
-      <w:pPr>
-        <w:numPr>
-          <w:ilvl w:val="1"/>
-          <w:numId w:val="1022"/>
-        </w:numPr>
-        <w:pStyle w:val="Compact"/>
-      </w:pPr>
-      <w:r>
-        <w:t xml:space="preserve">M2U4 Onboarding &amp; Tutorial Design — vendor setup + first-order guidance.</w:t>
-      </w:r>
-    </w:p>
-    <w:p>
-      <w:pPr>
-        <w:numPr>
           <w:ilvl w:val="0"/>
           <w:numId w:val="1018"/>
         </w:numPr>
@@ -2687,7 +2636,7 @@
         <w:t xml:space="preserve"> </w:t>
       </w:r>
       <w:r>
-        <w:t xml:space="preserve">0 artists — the art surface is covered by the M1D11/M2D11 conditionals, taken as Design goals (see Design M1/M2).</w:t>
+        <w:t xml:space="preserve">0 artists — the art surface is covered by the M1D11/M2D11 conditionals, taken as Design goals by the single designer (see Design M1/M2).</w:t>
       </w:r>
     </w:p>
     <w:p>

</xml_diff>